<commit_message>
Pitch : présentations refaites à partir de la CAO SolidWorks, style sobre
- Drone présenté tel que conçu : VTOL à rotors basculants (2 moteurs avant
  basculants, 1 moteur arrière), empennage en V
- Fond blanc, captures SolidWorks, une couleur d'accent, sans pictogrammes
- Un seul générateur pour les versions 9 et 17 diapos, scripts oraux réécrits
- Questions-réponses mises à jour pour la nouvelle configuration

Co-Authored-By: Claude Opus 5.5 <noreply@anthropic.com>
Claude-Session: https://claude.ai/code/session_01JGe5HuVVxU57xxDiTHq6Ld
</commit_message>
<xml_diff>
--- a/pitch/questions_reponses.docx
+++ b/pitch/questions_reponses.docx
@@ -49,18 +49,7 @@
       </w:pPr>
       <w:r>
         <w:rPr/>
-        <w:t xml:space="preserve">Les réponses s'appuient sur nos documents : la fiche projet, la fiche technique IA, </w:t>
-      </w:r>
-      <w:r>
-        <w:rPr>
-          <w:rFonts w:ascii="Consolas" w:hAnsi="Consolas"/>
-          <w:color w:val="007FA8"/>
-        </w:rPr>
-        <w:t>drone/fiche_technique_complete.md</w:t>
-      </w:r>
-      <w:r>
-        <w:rPr/>
-        <w:t xml:space="preserve">, les paramètres ArduPilot et le code </w:t>
+        <w:t xml:space="preserve">Les réponses s'appuient sur la fiche projet, la fiche technique IA, la CAO SolidWorks (VTOL à rotors basculants, empennage en V) et le code </w:t>
       </w:r>
       <w:r>
         <w:rPr>
@@ -125,11 +114,21 @@
         <w:rPr>
           <w:b/>
         </w:rPr>
-        <w:t>1. Pourquoi un VTOL hybride plutôt qu'un multirotor ou un avion ?</w:t>
+        <w:t>1. Pourquoi un VTOL à rotors basculants plutôt qu'un multirotor ou un avion ?</w:t>
       </w:r>
       <w:r>
         <w:rPr/>
-        <w:t xml:space="preserve"> Le multirotor décolle partout, mais il porte tout son poids avec ses moteurs : environ 1 000 W en stationnaire pour le SA-1. L'avion vole sur son aile, environ 280 W en croisière, mais il lui faut une piste. L'hybride décolle sans piste, puis vole 3 à 4 fois plus économiquement. C'est indispensable pour viser 30 à 45 minutes.</w:t>
+        <w:t xml:space="preserve"> Le multirotor décolle partout mais porte tout son poids avec ses moteurs : il vole peu de temps. L'avion vole longtemps mais il lui faut une piste. Notre drone fait les deux. Et contrairement à un quadplane, qui transporte en croisière quatre moteurs arrêtés, nos deux moteurs avant servent au décollage </w:t>
+      </w:r>
+      <w:r>
+        <w:rPr>
+          <w:b/>
+        </w:rPr>
+        <w:t>et</w:t>
+      </w:r>
+      <w:r>
+        <w:rPr/>
+        <w:t xml:space="preserve"> à la croisière : moins de masse inutile, moins de traînée.</w:t>
       </w:r>
     </w:p>
     <w:p>
@@ -137,11 +136,11 @@
         <w:rPr>
           <w:b/>
         </w:rPr>
-        <w:t>2. Quelles sont les dimensions et la masse du drone ?</w:t>
+        <w:t>2. Pourquoi trois moteurs et pas quatre ?</w:t>
       </w:r>
       <w:r>
         <w:rPr/>
-        <w:t xml:space="preserve"> Envergure de 2,0 m, surface alaire de 0,56 m² et environ 6,4 kg au décollage. Cette masse comprend une marge d'intégration de 200 g. La batterie pèse à elle seule 2,05 kg, soit environ un tiers de la masse.</w:t>
+        <w:t xml:space="preserve"> C'est plus léger et ça consomme moins. En vol stationnaire, le contrôle du lacet (rotation sur lui-même) se fait en inclinant légèrement les deux moteurs avant en sens opposé : pas besoin d'un quatrième moteur. La contrepartie, c'est qu'il n'y a pas de redondance en stationnaire. On limite donc cette phase au décollage et à l'atterrissage.</w:t>
       </w:r>
     </w:p>
     <w:p>
@@ -149,22 +148,11 @@
         <w:rPr>
           <w:b/>
         </w:rPr>
-        <w:t>3. Comment avez-vous dimensionné les moteurs verticaux ?</w:t>
+        <w:t>3. Comment fonctionne le basculement des moteurs ?</w:t>
       </w:r>
       <w:r>
         <w:rPr/>
-        <w:t xml:space="preserve"> On part de la masse maximale et on exige une réserve de poussée pour contrôler le drone par vent et en cas de rafale, soit environ 2,9 kgf par moteur. Avec des hélices de 15 pouces, on choisit un moteur et un ESC de 40 A qui fournissent cette poussée en 6S. Le calcul se trouve dans </w:t>
-      </w:r>
-      <w:r>
-        <w:rPr>
-          <w:rFonts w:ascii="Consolas" w:hAnsi="Consolas"/>
-          <w:color w:val="007FA8"/>
-        </w:rPr>
-        <w:t>drone/calculs/dimensionnement.py</w:t>
-      </w:r>
-      <w:r>
-        <w:rPr/>
-        <w:t>.</w:t>
+        <w:t xml:space="preserve"> Chaque nacelle a un servomoteur commandé par le contrôleur de vol. Les moteurs passent progressivement de la position verticale à la position horizontale pendant la transition. Nous choisissons des servos à engrenages métal, avec une bonne marge de couple, et nous les testons au banc avant le vol.</w:t>
       </w:r>
     </w:p>
     <w:p>
@@ -172,11 +160,11 @@
         <w:rPr>
           <w:b/>
         </w:rPr>
-        <w:t>4. Comment calculez-vous l'autonomie ?</w:t>
+        <w:t>4. Et si un servo de basculement se bloque ?</w:t>
       </w:r>
       <w:r>
         <w:rPr/>
-        <w:t xml:space="preserve"> La batterie est une LiPo 6S de 16 000 mAh, soit 355 Wh, dont environ 80 % sont utilisables. On soustrait l'énergie du décollage, de la transition et de l'atterrissage, puis on divise le reste par la puissance de croisière (≈ 280 W). On obtient environ 50 minutes en théorie. Nous annonçons 30 à 45 minutes pour couvrir le vent, la chaleur et le vieillissement de la batterie. Seul l'essai en vol fera foi.</w:t>
+        <w:t xml:space="preserve"> C'est le point critique de cette configuration, et nous le traitons sérieusement. Le débattement des servos est vérifié à chaque check-list avant vol. Si un servo se bloque en position verticale, le drone reste en mode multirotor et atterrit à la verticale. Les essais de transition se font d'abord à hauteur de sécurité, au-dessus d'une zone dégagée.</w:t>
       </w:r>
     </w:p>
     <w:p>
@@ -184,21 +172,11 @@
         <w:rPr>
           <w:b/>
         </w:rPr>
-        <w:t>5. Pourquoi deux moteurs de croisière sur les poutres ?</w:t>
+        <w:t>5. Pourquoi un empennage en V ?</w:t>
       </w:r>
       <w:r>
         <w:rPr/>
-        <w:t xml:space="preserve"> Pour la redondance : si un moteur s'arrête, le drone peut encore rejoindre sa zone de retour. La poussée est aussi mieux répartie, et le fuselage arrière reste libre. </w:t>
-      </w:r>
-      <w:r>
-        <w:rPr>
-          <w:b/>
-        </w:rPr>
-        <w:t>[à confirmer]</w:t>
-      </w:r>
-      <w:r>
-        <w:rPr/>
-        <w:t xml:space="preserve"> : notre maquette d'étude avait un seul moteur propulsif. La configuration finale est celle de la CAO SolidWorks, et nous devons présenter la même partout.</w:t>
+        <w:t xml:space="preserve"> Deux surfaces au lieu de trois (dérive + profondeur), donc moins de masse, moins de traînée et moins de servos. Chaque gouverne agit à la fois en profondeur et en direction ; ArduPilot fait ce mélange automatiquement. Et cette forme laisse la place au moteur arrière sous la queue.</w:t>
       </w:r>
     </w:p>
     <w:p>
@@ -206,11 +184,21 @@
         <w:rPr>
           <w:b/>
         </w:rPr>
-        <w:t>6. Où est le centre de gravité et comment le contrôlez-vous ?</w:t>
+        <w:t>6. Quelles sont les dimensions et la masse du drone ?</w:t>
       </w:r>
       <w:r>
         <w:rPr/>
-        <w:t xml:space="preserve"> Il doit se situer à environ 25-30 % de la corde de l'aile, et aussi au centre des 4 moteurs verticaux. La batterie est montée sur un rail réglable : on l'avance ou on la recule. On vérifie le centrage en suspendant le drone avant chaque premier vol.</w:t>
+        <w:t xml:space="preserve"> </w:t>
+      </w:r>
+      <w:r>
+        <w:rPr>
+          <w:b/>
+        </w:rPr>
+        <w:t>[à compléter avec les valeurs SolidWorks]</w:t>
+      </w:r>
+      <w:r>
+        <w:rPr/>
+        <w:t xml:space="preserve"> : envergure, longueur, masse au décollage. Préparez une réponse chiffrée et sachez dire comment la masse a été obtenue (bilan composant par composant + masses calculées par SolidWorks).</w:t>
       </w:r>
     </w:p>
     <w:p>
@@ -218,11 +206,17 @@
         <w:rPr>
           <w:b/>
         </w:rPr>
-        <w:t>7. Pourquoi le carbone, et quel est son inconvénient ?</w:t>
+        <w:t>7. Comment arrivez-vous à 30–45 minutes d'autonomie ?</w:t>
       </w:r>
       <w:r>
         <w:rPr/>
-        <w:t xml:space="preserve"> Le carbone est très rigide et léger, ce qui est idéal pour les poutres et le longeron. Son défaut : il est conducteur et bloque les ondes radio. Nous plaçons donc les antennes dans des zones en fibre de verre, ou bien à l'extérieur.</w:t>
+        <w:t xml:space="preserve"> En croisière, c'est l'aile qui porte : la puissance nécessaire est bien plus faible qu'en stationnaire. On prend l'énergie utilisable de la batterie (environ 80 % de sa capacité), on retire les phases de décollage, transition et atterrissage, et on divise par la puissance de croisière. Nous gardons une marge pour le vent et la chaleur. Seuls les essais en vol feront foi. </w:t>
+      </w:r>
+      <w:r>
+        <w:rPr>
+          <w:b/>
+        </w:rPr>
+        <w:t>[à compléter : capacité de la batterie retenue]</w:t>
       </w:r>
     </w:p>
     <w:p>
@@ -230,11 +224,11 @@
         <w:rPr>
           <w:b/>
         </w:rPr>
-        <w:t>8. Que se passe-t-il si un moteur vertical tombe en panne ?</w:t>
+        <w:t>8. Où est le centre de gravité ?</w:t>
       </w:r>
       <w:r>
         <w:rPr/>
-        <w:t xml:space="preserve"> En croisière, aucun impact, puisque l'aile porte le drone. En stationnaire, un quadri perd une partie de son contrôle. On limite donc le temps passé en stationnaire au strict décollage et atterrissage, et on le fait à faible hauteur, au-dessus d'une zone dégagée. La check-list d'urgence décrit la conduite à tenir.</w:t>
+        <w:t xml:space="preserve"> En croisière, il doit se trouver vers 25 à 30 % de la corde de l'aile. En stationnaire, il doit être équilibré entre les deux moteurs avant et le moteur arrière. La batterie est placée de façon à pouvoir être avancée ou reculée pour régler le centrage, vérifié avant chaque premier vol.</w:t>
       </w:r>
     </w:p>
     <w:p>
@@ -242,11 +236,11 @@
         <w:rPr>
           <w:b/>
         </w:rPr>
-        <w:t>9. Quelles cartes électroniques concevez-vous vous-mêmes ?</w:t>
+        <w:t>9. Quelles cartes électroniques concevez-vous ?</w:t>
       </w:r>
       <w:r>
         <w:rPr/>
-        <w:t xml:space="preserve"> La carte de distribution de puissance, le câblage et l'intégration du contrôleur de vol STM32H743. Celle-ci comprend un 5 V propre pour les radios, un BEC dédié de 5 V / 5 A pour le Raspberry Pi et assez de ports série. En secours, nous gardons un contrôleur du commerce (Pixhawk / Matek H743).</w:t>
+        <w:t xml:space="preserve"> La distribution de puissance, le câblage et l'intégration du contrôleur de vol STM32H743 : 5 V propre pour les radios, alimentation dédiée 5 V / 5 A pour le Raspberry Pi, assez de ports série et les sorties pour les servos de basculement. En secours, un contrôleur du commerce (Matek H743 ou Pixhawk).</w:t>
       </w:r>
     </w:p>
     <w:p>
@@ -254,11 +248,11 @@
         <w:rPr>
           <w:b/>
         </w:rPr>
-        <w:t>10. Quelles conditions météo le drone supporte-t-il ?</w:t>
+        <w:t>10. Quels matériaux, et quelles conditions de vol ?</w:t>
       </w:r>
       <w:r>
         <w:rPr/>
-        <w:t xml:space="preserve"> Visé : un vent jusqu'à environ 8 m/s et des températures jusqu'à 40 °C. Pas de vol sous la pluie pour le prototype, car l'électronique n'est pas étanche. Ces limites seront validées en essai, pas seulement sur le papier.</w:t>
+        <w:t xml:space="preserve"> Composite et carbone pour la rigidité, avec les antennes placées hors des zones en carbone, qui bloquent les ondes. Le mât sur le dos éloigne le GPS des perturbations. Pas de vol sous la pluie pour le prototype ; les limites de vent seront fixées après les essais.</w:t>
       </w:r>
     </w:p>
     <w:p>
@@ -290,18 +284,7 @@
       </w:r>
       <w:r>
         <w:rPr/>
-        <w:t xml:space="preserve"> La configuration de la carte STM32H743 (son fichier de description matérielle), les paramètres du SA-1, la délimitation de zone et les règles de sécurité. Ces dernières : retour si la liaison est perdue, atterrissage vertical si la batterie est critique, retour si la zone est franchie. Tout est versionné dans </w:t>
-      </w:r>
-      <w:r>
-        <w:rPr>
-          <w:rFonts w:ascii="Consolas" w:hAnsi="Consolas"/>
-          <w:color w:val="007FA8"/>
-        </w:rPr>
-        <w:t>sentinelle_sa1.param</w:t>
-      </w:r>
-      <w:r>
-        <w:rPr/>
-        <w:t>.</w:t>
+        <w:t xml:space="preserve"> La description matérielle de notre carte STM32H743, la configuration à rotors basculants (tricoptère avec deux moteurs avant inclinables), le mélange de l'empennage en V, la délimitation de zone et les règles de sécurité : retour si la liaison est perdue, atterrissage vertical si la batterie est critique, retour si la zone est franchie.</w:t>
       </w:r>
     </w:p>
     <w:p>
@@ -325,7 +308,7 @@
       </w:r>
       <w:r>
         <w:rPr/>
-        <w:t xml:space="preserve"> Le moteur de croisière accélère pendant que les moteurs verticaux maintiennent l'altitude. Au-dessus de 15 m/s de vitesse air, la transition se termine et les moteurs verticaux s'arrêtent. En croisière, si la vitesse redescend sous 13 m/s, les moteurs verticaux reviennent aider automatiquement : c'est l'assistance anti-décrochage.</w:t>
+        <w:t xml:space="preserve"> Les deux moteurs avant basculent progressivement vers l'avant : le drone accélère et l'aile commence à porter. Quand la vitesse air mesurée par le tube de Pitot est suffisante, les moteurs avant sont à l'horizontale et le moteur arrière s'arrête. À l'atterrissage, c'est l'inverse. Si la vitesse chute en croisière, ArduPilot peut ramener les moteurs vers le haut pour éviter le décrochage.</w:t>
       </w:r>
     </w:p>
     <w:p>
@@ -373,7 +356,7 @@
       </w:r>
       <w:r>
         <w:rPr/>
-        <w:t xml:space="preserve"> Avec SITL, le simulateur officiel d'ArduPilot : le vrai code de vol tourne sur PC avec un drone virtuel. On y teste les missions, la délimitation de zone, les sécurités et la station sol avant tout vol réel. On passe ensuite aux tests sur table, puis aux essais en vol.</w:t>
+        <w:t xml:space="preserve"> Avec SITL, le simulateur officiel d'ArduPilot : le vrai code de vol tourne sur PC avec un drone virtuel, et il existe un modèle de tricoptère à rotors basculants proche du nôtre. On y teste les missions, la transition, la délimitation de zone, les sécurités et la station sol avant tout vol réel. On passe ensuite aux tests sur table, puis aux essais en vol.</w:t>
       </w:r>
     </w:p>
     <w:p>
@@ -533,7 +516,7 @@
       </w:r>
       <w:r>
         <w:rPr/>
-        <w:t xml:space="preserve"> Une fiche technique complète qui explique chaque composant, un guide de conception et d'assemblage, les calculs de dimensionnement, les paramètres ArduPilot, les check-lists, des vidéos explicatives et le code de l'IA avec son protocole de validation. Tout est versionné sur notre dépôt.</w:t>
+        <w:t xml:space="preserve"> Le dossier de conception (schémas, dimensionnement, analyse de sécurité), la CAO SolidWorks, les check-lists et procédures d'urgence, et le code du module IA avec son protocole de validation. Tout est versionné sur notre dépôt.</w:t>
       </w:r>
     </w:p>
     <w:p>
@@ -747,7 +730,7 @@
       </w:r>
       <w:r>
         <w:rPr/>
-        <w:t xml:space="preserve"> FOD-A, une base publique de débris de piste : 31 catégories et plus de 30 000 objets annotés. Nous la complétons avec nos propres images filmées avec la caméra du drone, et avec des scènes vides pour réduire les fausses alertes. Entraînement, validation et test sont séparés par séquence vidéo, pour ne pas tricher.</w:t>
+        <w:t xml:space="preserve"> FOD-A, une base publique de débris de piste : 31 catégories et plus de 30 000 objets annotés. Nous la complétons avec des images prises par la caméra du drone, pour coller à son angle de vue, et avec des scènes vides pour réduire les fausses alertes. Entraînement, validation et test sont séparés par séquence vidéo, pour ne pas tricher.</w:t>
       </w:r>
     </w:p>
     <w:p>
@@ -815,11 +798,11 @@
         <w:rPr>
           <w:b/>
         </w:rPr>
-        <w:t>9. Que se passe-t-il sans réseau ?</w:t>
+        <w:t>9. Avez-vous déjà des résultats ?</w:t>
       </w:r>
       <w:r>
         <w:rPr/>
-        <w:t xml:space="preserve"> L'inférence se fait entièrement à bord, sans cloud. Les alertes sont enregistrées dans un journal local (SQLite) et envoyées automatiquement quand la liaison revient. Nos tests le vérifient en coupant volontairement la liaison.</w:t>
+        <w:t xml:space="preserve"> Répondre sur ce qui est vrai : « La chaîne complète est en place : code de détection, de suivi et d'alerte, conversion pour le Hailo, journal hors connexion et protocole de test. Les chiffres que nous présenterons seront ceux mesurés avec le modèle final, sur les images de notre caméra. » Ne pas annoncer de score ni de vitesse.</w:t>
       </w:r>
     </w:p>
     <w:p>
@@ -827,11 +810,11 @@
         <w:rPr>
           <w:b/>
         </w:rPr>
-        <w:t>10. Et la nuit ? Et la vie privée ?</w:t>
+        <w:t>10. Et sans réseau ? La nuit ? La vie privée ?</w:t>
       </w:r>
       <w:r>
         <w:rPr/>
-        <w:t xml:space="preserve"> La nuit, il faut la caméra thermique, et le modèle doit être adapté avec des images thermiques : c'est une étape suivante, que nous n'annonçons pas comme acquise. Pour la vie privée, nous détectons « une personne », jamais son identité : pas de reconnaissance faciale. Seules les images d'alerte sont conservées, avec un accès restreint.</w:t>
+        <w:t xml:space="preserve"> Sans réseau, tout se fait à bord et les alertes sont gardées puis renvoyées. La nuit, il faut la caméra thermique et adapter le modèle à ces images : c'est une étape suivante. Pour la vie privée, on détecte « une personne », jamais son identité, et seules les images d'alerte sont conservées.</w:t>
       </w:r>
     </w:p>
     <w:p>
@@ -869,11 +852,11 @@
         <w:rPr>
           <w:b/>
         </w:rPr>
-        <w:t>2. Qu'est-ce qui est déjà fabriqué ou testé ?</w:t>
+        <w:t>2. Où en est le drone ?</w:t>
       </w:r>
       <w:r>
         <w:rPr/>
-        <w:t xml:space="preserve"> Répondez avec l'état réel au jour du pitch (pièces imprimées ou découpées, cartes reçues, tests sur banc). Il vaut mieux dire honnêtement « en cours » qu'annoncer un vol qui n'a pas eu lieu.</w:t>
+        <w:t xml:space="preserve"> « La conception CAO est terminée. Nous sommes en phase de prototypage et d'intégration, et les essais au sol puis en vol sont prévus en novembre. » Ne pas annoncer un vol ou une mesure qui n'a pas eu lieu.</w:t>
       </w:r>
     </w:p>
     <w:p>
@@ -885,7 +868,7 @@
       </w:r>
       <w:r>
         <w:rPr/>
-        <w:t xml:space="preserve"> (Israel / Makafui) La transition en vol et les délais de livraison des composants radio. Nos réponses : simulation SITL et essais progressifs, contrôleur du commerce en secours, commandes passées en priorité.</w:t>
+        <w:t xml:space="preserve"> (Israel / Makafui) La transition en vol, avec le basculement des moteurs, et les délais de livraison des composants. Nos réponses : simulation SITL, essais progressifs (d'abord en stationnaire, puis transitions à hauteur de sécurité), contrôleur du commerce en secours et commandes passées en priorité.</w:t>
       </w:r>
     </w:p>
     <w:p>

</xml_diff>